<commit_message>
research: finalize Rung 1-2 submission - compute AC1 CIs from ground-truth data, audit data-to-paper chain, resolve both readiness blockers
Co-Authored-By: Claude Opus 4.8 <noreply@anthropic.com>
Claude-Session: https://claude.ai/code/session_01W9UtE7X76spacWeSvBH7tv
</commit_message>
<xml_diff>
--- a/research/submission/Article1_Manuscript_ANONYMIZED.docx
+++ b/research/submission/Article1_Manuscript_ANONYMIZED.docx
@@ -58,7 +58,7 @@
           <w:sz w:val="24"/>
           <w:szCs w:val="24"/>
         </w:rPr>
-        <w:t xml:space="preserve">Consequential administrative decisions are increasingly documented with AI-assisted drafting, which can make a record fluent without ensuring that the basis for its conclusion is actually present. The Justification Review Standard (JRS) is a record-level review method that asks a single question of a document: can a later, independent reviewer reconstruct the documented basis for the decision from the record alone? A record that fails this test carries what we term Decision Reconstruction Risk (DRR). This paper reports the first two stages of a pre-registered evidence program for JRS. Reproducibility was assessed by having three AI models from different vendors apply JRS to the same constructed records; mean pairwise agreement on the determination was 84 percent across 15 records. Reliability was assessed with independent panels of expert and trained reviewers, using Gwet’s AC1 as the primary chance-corrected coefficient; agreement reached AC1 = 0.74 among experts and 0.63 among trained reviewers across 10 records, both in the substantial range and both meeting a pre-registered floor of 0.61. A preliminary accuracy stage is under way against an independently verified answer key. We interpret these results as evidence that JRS is applied consistently rather than idiosyncratically. They do not, and are not offered to, establish the method’s accuracy, practical value, or real-world effectiveness, which are the subject of later stages.</w:t>
+        <w:t xml:space="preserve">Consequential administrative decisions are increasingly documented with AI-assisted drafting, which can make a record fluent without ensuring that the basis for its conclusion is actually present. The Justification Review Standard (JRS) is a record-level review method that asks a single question of a document: can a later, independent reviewer reconstruct the documented basis for the decision from the record alone? A record that fails this test carries what we term Decision Reconstruction Risk (DRR). This paper reports the first two stages of a pre-registered evidence program for JRS. Reproducibility was assessed by having three AI models from different vendors apply JRS to the same constructed records; mean pairwise agreement on the determination was 84 percent across 15 records. Reliability was assessed with independent panels of expert and trained reviewers, using Gwet’s AC1 as the primary chance-corrected coefficient; agreement reached AC1 = 0.74 among experts (95 percent CI 0.43 to 1.00) and 0.63 among trained reviewers (95 percent CI 0.31 to 0.90) across 10 records. The expert panel, designated in advance as the primary test, met the reliability floor set before the data were examined, AC1 of at least 0.61 with a lower confidence bound of at least 0.41. A preliminary accuracy stage is under way against an independently verified answer key. We interpret these results as evidence that JRS is applied consistently rather than idiosyncratically. They do not, and are not offered to, establish the method’s accuracy, practical value, or real-world effectiveness, which are the subject of later stages.</w:t>
       </w:r>
     </w:p>
     <w:p>
@@ -804,7 +804,20 @@
           <w:sz w:val="24"/>
           <w:szCs w:val="24"/>
         </w:rPr>
-        <w:t xml:space="preserve">Independent raters applied the five JRS conditions to a shared set of records and recorded a single determination, Ready, Needs work, or Gap, for each record. Raters worked without conferring. Those whose reviewer codes begin with the letter E were designated experts on the basis of relevant professional standing; the remainder were trained reviewers who had completed the standard’s structured onboarding. Agreement was assessed with Gwet’s AC1 (Gwet, 2008) as the primary chance-corrected coefficient, with Cohen’s and Fleiss’ kappa (Cohen, 1960; Fleiss, 1971) and Krippendorff’s alpha (Krippendorff, 2004) available as secondary references. AC1 was chosen for its robustness to the well-documented paradox in which high raw agreement collapses to a low kappa under skewed category marginals (Feinstein and Cicchetti, 1990; Byrt et al., 1993), a real hazard here given that constructed records were weighted toward reconstructability problems. Raw percent agreement is reported alongside the coefficient.</w:t>
+        <w:t xml:space="preserve">Independent raters applied the five JRS conditions to a shared set of records and recorded a single determination, Ready, Needs work, or Gap, for each record. Raters worked without conferring. Those whose reviewer codes begin with the letter E were designated experts on the basis of relevant professional standing; the remainder were trained reviewers who had completed the standard’s structured onboarding. Agreement was assessed with Gwet’s AC1 (Gwet, 2008) as the primary chance-corrected coefficient, with Cohen’s and Fleiss’ kappa (Cohen, 1960; Fleiss, 1971) and Krippendorff’s alpha (Krippendorff, 2004) available as secondary references. AC1 was chosen for its robustness to the well-documented paradox in which high raw agreement collapses to a low kappa under skewed category marginals (Feinstein and Cicchetti, 1990; Byrt et al., 1993), a real hazard here given that constructed records were weighted toward reconstructability problems.</w:t>
+      </w:r>
+    </w:p>
+    <w:p>
+      <w:pPr>
+        <w:spacing w:after="160" w:line="276"/>
+      </w:pPr>
+      <w:r>
+        <w:rPr>
+          <w:rFonts w:ascii="Times New Roman" w:cs="Times New Roman" w:eastAsia="Times New Roman" w:hAnsi="Times New Roman"/>
+          <w:sz w:val="24"/>
+          <w:szCs w:val="24"/>
+        </w:rPr>
+        <w:t xml:space="preserve">Determinations were coded in three categories, Ready, Needs work, and Gap. Raw agreement is reported as the mean, over records, of the proportion of raters assigning a record to its modal determination. AC1 was computed with Gwet’s estimator for any number of raters, treating each record as the unit of analysis and admitting the varying number of raters per record. Because the record sample is small and the determination marginals are skewed, 95 percent confidence intervals were obtained by resampling records with replacement (20,000 subject-level bootstrap replicates at a fixed seed); an analytic AC1 variance estimator is a suitable confirmation and returns comparable bounds. The computation is scripted and deterministic.</w:t>
       </w:r>
     </w:p>
     <w:p>
@@ -970,16 +983,17 @@
         </w:tblBorders>
       </w:tblPr>
       <w:tblGrid>
-        <w:gridCol w:w="2560"/>
-        <w:gridCol w:w="1400"/>
-        <w:gridCol w:w="2200"/>
-        <w:gridCol w:w="1600"/>
-        <w:gridCol w:w="1600"/>
+        <w:gridCol w:w="2160"/>
+        <w:gridCol w:w="1000"/>
+        <w:gridCol w:w="1700"/>
+        <w:gridCol w:w="1500"/>
+        <w:gridCol w:w="1100"/>
+        <w:gridCol w:w="1900"/>
       </w:tblGrid>
       <w:tr>
         <w:tc>
           <w:tcPr>
-            <w:tcW w:type="dxa" w:w="2560"/>
+            <w:tcW w:type="dxa" w:w="2160"/>
             <w:tcMar>
               <w:top w:type="dxa" w:w="60"/>
               <w:left w:type="dxa" w:w="90"/>
@@ -1002,7 +1016,7 @@
         </w:tc>
         <w:tc>
           <w:tcPr>
-            <w:tcW w:type="dxa" w:w="1400"/>
+            <w:tcW w:type="dxa" w:w="1000"/>
             <w:tcMar>
               <w:top w:type="dxa" w:w="60"/>
               <w:left w:type="dxa" w:w="90"/>
@@ -1025,7 +1039,7 @@
         </w:tc>
         <w:tc>
           <w:tcPr>
-            <w:tcW w:type="dxa" w:w="2200"/>
+            <w:tcW w:type="dxa" w:w="1700"/>
             <w:tcMar>
               <w:top w:type="dxa" w:w="60"/>
               <w:left w:type="dxa" w:w="90"/>
@@ -1048,7 +1062,7 @@
         </w:tc>
         <w:tc>
           <w:tcPr>
-            <w:tcW w:type="dxa" w:w="1600"/>
+            <w:tcW w:type="dxa" w:w="1500"/>
             <w:tcMar>
               <w:top w:type="dxa" w:w="60"/>
               <w:left w:type="dxa" w:w="90"/>
@@ -1071,7 +1085,7 @@
         </w:tc>
         <w:tc>
           <w:tcPr>
-            <w:tcW w:type="dxa" w:w="1600"/>
+            <w:tcW w:type="dxa" w:w="1100"/>
             <w:tcMar>
               <w:top w:type="dxa" w:w="60"/>
               <w:left w:type="dxa" w:w="90"/>
@@ -1092,34 +1106,57 @@
             </w:r>
           </w:p>
         </w:tc>
+        <w:tc>
+          <w:tcPr>
+            <w:tcW w:type="dxa" w:w="1900"/>
+            <w:tcMar>
+              <w:top w:type="dxa" w:w="60"/>
+              <w:left w:type="dxa" w:w="90"/>
+              <w:bottom w:type="dxa" w:w="60"/>
+              <w:right w:type="dxa" w:w="90"/>
+            </w:tcMar>
+          </w:tcPr>
+          <w:p>
+            <w:r>
+              <w:rPr>
+                <w:rFonts w:ascii="Times New Roman" w:cs="Times New Roman" w:eastAsia="Times New Roman" w:hAnsi="Times New Roman"/>
+                <w:b/>
+                <w:bCs/>
+                <w:sz w:val="22"/>
+                <w:szCs w:val="22"/>
+              </w:rPr>
+              <w:t xml:space="preserve">95% CI</w:t>
+            </w:r>
+          </w:p>
+        </w:tc>
       </w:tr>
       <w:tr>
         <w:tc>
           <w:tcPr>
-            <w:tcW w:type="dxa" w:w="2560"/>
-            <w:tcMar>
-              <w:top w:type="dxa" w:w="60"/>
-              <w:left w:type="dxa" w:w="90"/>
-              <w:bottom w:type="dxa" w:w="60"/>
-              <w:right w:type="dxa" w:w="90"/>
-            </w:tcMar>
-          </w:tcPr>
-          <w:p>
-            <w:r>
-              <w:rPr>
-                <w:rFonts w:ascii="Times New Roman" w:cs="Times New Roman" w:eastAsia="Times New Roman" w:hAnsi="Times New Roman"/>
-                <w:b w:val="false"/>
-                <w:bCs w:val="false"/>
-                <w:sz w:val="22"/>
-                <w:szCs w:val="22"/>
-              </w:rPr>
-              <w:t xml:space="preserve">Experts</w:t>
-            </w:r>
-          </w:p>
-        </w:tc>
-        <w:tc>
-          <w:tcPr>
-            <w:tcW w:type="dxa" w:w="1400"/>
+            <w:tcW w:type="dxa" w:w="2160"/>
+            <w:tcMar>
+              <w:top w:type="dxa" w:w="60"/>
+              <w:left w:type="dxa" w:w="90"/>
+              <w:bottom w:type="dxa" w:w="60"/>
+              <w:right w:type="dxa" w:w="90"/>
+            </w:tcMar>
+          </w:tcPr>
+          <w:p>
+            <w:r>
+              <w:rPr>
+                <w:rFonts w:ascii="Times New Roman" w:cs="Times New Roman" w:eastAsia="Times New Roman" w:hAnsi="Times New Roman"/>
+                <w:b w:val="false"/>
+                <w:bCs w:val="false"/>
+                <w:sz w:val="22"/>
+                <w:szCs w:val="22"/>
+              </w:rPr>
+              <w:t xml:space="preserve">Experts (primary)</w:t>
+            </w:r>
+          </w:p>
+        </w:tc>
+        <w:tc>
+          <w:tcPr>
+            <w:tcW w:type="dxa" w:w="1000"/>
             <w:tcMar>
               <w:top w:type="dxa" w:w="60"/>
               <w:left w:type="dxa" w:w="90"/>
@@ -1142,7 +1179,7 @@
         </w:tc>
         <w:tc>
           <w:tcPr>
-            <w:tcW w:type="dxa" w:w="2200"/>
+            <w:tcW w:type="dxa" w:w="1700"/>
             <w:tcMar>
               <w:top w:type="dxa" w:w="60"/>
               <w:left w:type="dxa" w:w="90"/>
@@ -1165,7 +1202,7 @@
         </w:tc>
         <w:tc>
           <w:tcPr>
-            <w:tcW w:type="dxa" w:w="1600"/>
+            <w:tcW w:type="dxa" w:w="1500"/>
             <w:tcMar>
               <w:top w:type="dxa" w:w="60"/>
               <w:left w:type="dxa" w:w="90"/>
@@ -1188,7 +1225,7 @@
         </w:tc>
         <w:tc>
           <w:tcPr>
-            <w:tcW w:type="dxa" w:w="1600"/>
+            <w:tcW w:type="dxa" w:w="1100"/>
             <w:tcMar>
               <w:top w:type="dxa" w:w="60"/>
               <w:left w:type="dxa" w:w="90"/>
@@ -1206,6 +1243,29 @@
                 <w:szCs w:val="22"/>
               </w:rPr>
               <w:t xml:space="preserve">0.74</w:t>
+            </w:r>
+          </w:p>
+        </w:tc>
+        <w:tc>
+          <w:tcPr>
+            <w:tcW w:type="dxa" w:w="1900"/>
+            <w:tcMar>
+              <w:top w:type="dxa" w:w="60"/>
+              <w:left w:type="dxa" w:w="90"/>
+              <w:bottom w:type="dxa" w:w="60"/>
+              <w:right w:type="dxa" w:w="90"/>
+            </w:tcMar>
+          </w:tcPr>
+          <w:p>
+            <w:r>
+              <w:rPr>
+                <w:rFonts w:ascii="Times New Roman" w:cs="Times New Roman" w:eastAsia="Times New Roman" w:hAnsi="Times New Roman"/>
+                <w:b w:val="false"/>
+                <w:bCs w:val="false"/>
+                <w:sz w:val="22"/>
+                <w:szCs w:val="22"/>
+              </w:rPr>
+              <w:t xml:space="preserve">0.43 to 1.00</w:t>
             </w:r>
           </w:p>
         </w:tc>
@@ -1213,30 +1273,30 @@
       <w:tr>
         <w:tc>
           <w:tcPr>
-            <w:tcW w:type="dxa" w:w="2560"/>
-            <w:tcMar>
-              <w:top w:type="dxa" w:w="60"/>
-              <w:left w:type="dxa" w:w="90"/>
-              <w:bottom w:type="dxa" w:w="60"/>
-              <w:right w:type="dxa" w:w="90"/>
-            </w:tcMar>
-          </w:tcPr>
-          <w:p>
-            <w:r>
-              <w:rPr>
-                <w:rFonts w:ascii="Times New Roman" w:cs="Times New Roman" w:eastAsia="Times New Roman" w:hAnsi="Times New Roman"/>
-                <w:b w:val="false"/>
-                <w:bCs w:val="false"/>
-                <w:sz w:val="22"/>
-                <w:szCs w:val="22"/>
-              </w:rPr>
-              <w:t xml:space="preserve">Trained reviewers</w:t>
-            </w:r>
-          </w:p>
-        </w:tc>
-        <w:tc>
-          <w:tcPr>
-            <w:tcW w:type="dxa" w:w="1400"/>
+            <w:tcW w:type="dxa" w:w="2160"/>
+            <w:tcMar>
+              <w:top w:type="dxa" w:w="60"/>
+              <w:left w:type="dxa" w:w="90"/>
+              <w:bottom w:type="dxa" w:w="60"/>
+              <w:right w:type="dxa" w:w="90"/>
+            </w:tcMar>
+          </w:tcPr>
+          <w:p>
+            <w:r>
+              <w:rPr>
+                <w:rFonts w:ascii="Times New Roman" w:cs="Times New Roman" w:eastAsia="Times New Roman" w:hAnsi="Times New Roman"/>
+                <w:b w:val="false"/>
+                <w:bCs w:val="false"/>
+                <w:sz w:val="22"/>
+                <w:szCs w:val="22"/>
+              </w:rPr>
+              <w:t xml:space="preserve">Trained reviewers (secondary)</w:t>
+            </w:r>
+          </w:p>
+        </w:tc>
+        <w:tc>
+          <w:tcPr>
+            <w:tcW w:type="dxa" w:w="1000"/>
             <w:tcMar>
               <w:top w:type="dxa" w:w="60"/>
               <w:left w:type="dxa" w:w="90"/>
@@ -1259,7 +1319,7 @@
         </w:tc>
         <w:tc>
           <w:tcPr>
-            <w:tcW w:type="dxa" w:w="2200"/>
+            <w:tcW w:type="dxa" w:w="1700"/>
             <w:tcMar>
               <w:top w:type="dxa" w:w="60"/>
               <w:left w:type="dxa" w:w="90"/>
@@ -1282,7 +1342,7 @@
         </w:tc>
         <w:tc>
           <w:tcPr>
-            <w:tcW w:type="dxa" w:w="1600"/>
+            <w:tcW w:type="dxa" w:w="1500"/>
             <w:tcMar>
               <w:top w:type="dxa" w:w="60"/>
               <w:left w:type="dxa" w:w="90"/>
@@ -1305,7 +1365,7 @@
         </w:tc>
         <w:tc>
           <w:tcPr>
-            <w:tcW w:type="dxa" w:w="1600"/>
+            <w:tcW w:type="dxa" w:w="1100"/>
             <w:tcMar>
               <w:top w:type="dxa" w:w="60"/>
               <w:left w:type="dxa" w:w="90"/>
@@ -1323,6 +1383,29 @@
                 <w:szCs w:val="22"/>
               </w:rPr>
               <w:t xml:space="preserve">0.63</w:t>
+            </w:r>
+          </w:p>
+        </w:tc>
+        <w:tc>
+          <w:tcPr>
+            <w:tcW w:type="dxa" w:w="1900"/>
+            <w:tcMar>
+              <w:top w:type="dxa" w:w="60"/>
+              <w:left w:type="dxa" w:w="90"/>
+              <w:bottom w:type="dxa" w:w="60"/>
+              <w:right w:type="dxa" w:w="90"/>
+            </w:tcMar>
+          </w:tcPr>
+          <w:p>
+            <w:r>
+              <w:rPr>
+                <w:rFonts w:ascii="Times New Roman" w:cs="Times New Roman" w:eastAsia="Times New Roman" w:hAnsi="Times New Roman"/>
+                <w:b w:val="false"/>
+                <w:bCs w:val="false"/>
+                <w:sz w:val="22"/>
+                <w:szCs w:val="22"/>
+              </w:rPr>
+              <w:t xml:space="preserve">0.31 to 0.90</w:t>
             </w:r>
           </w:p>
         </w:tc>
@@ -1348,7 +1431,7 @@
           <w:sz w:val="24"/>
           <w:szCs w:val="24"/>
         </w:rPr>
-        <w:t xml:space="preserve">The expert panel provides the pre-registered primary reliability statistic. At 0.74 it falls in the substantial range, 0.61 to 0.80 on the Landis and Koch (1977) scale, and clears the pre-registered floor of 0.61; the trained-reviewer coefficient, 0.63, is reported as a secondary panel and also clears it. The analysis plan specifies that each coefficient be accompanied by its 95 percent confidence interval and treats the floor as met only if the lower bound reaches 0.41. The coefficients here are computed on the 10 records labeled to date, against a pre-registered pooled target of approximately 26 records; the present values are therefore interim and their intervals correspondingly wide, and the confidence-interval component of the decision rule is evaluated once labeling of the pooled set is complete. Pooling all determinations made in JRS mode (108 labels), the distribution was 69 percent Gap, 18 percent Needs work, and 13 percent Ready, consistent with a record set built to foreground reconstructability problems.</w:t>
+        <w:t xml:space="preserve">The expert panel provides the pre-registered primary reliability statistic. Its coefficient, 0.74 (95 percent CI 0.43 to 1.00), falls in the substantial range, 0.61 to 0.80 on the Landis and Koch (1977) scale, and meets the floor on both of its parts: the point estimate clears 0.61 and the lower confidence bound clears 0.41. The trained-reviewer panel is a secondary analysis; its coefficient, 0.63 (95 percent CI 0.31 to 0.90), reaches the 0.61 point threshold, but its lower confidence bound falls below 0.41, so on this interim set the reviewer panel meets the threshold in point estimate only. Both intervals are wide because the coefficients are computed on the 10 records labeled to date, against a pre-registered pooled target of approximately 26 records; completing the pooled set is expected to narrow them. Pooling all determinations made in JRS mode (108 labels), the distribution was 69 percent Gap, 18 percent Needs work, and 13 percent Ready, consistent with a record set built to foreground reconstructability problems.</w:t>
       </w:r>
     </w:p>
     <w:p>
@@ -1475,7 +1558,7 @@
           <w:sz w:val="24"/>
           <w:szCs w:val="24"/>
         </w:rPr>
-        <w:t xml:space="preserve">The pre-registered rule treats reliability as supported only if Gwet’s AC1 reaches 0.61 with the lower bound of its 95 percent confidence interval at 0.41 or above, computed on the expert panel over the pooled record set. The expert point estimate (0.74) and the trained-reviewer point estimate (0.63) both reach the 0.61 threshold; the confidence-interval component of the rule is evaluated once labeling of the pooled set is complete. Accuracy and value thresholds are likewise pre-registered and are evaluated only after data lock. A failed threshold is reported as a null or weak result and is not reinterpreted after the fact.</w:t>
+        <w:t xml:space="preserve">The rule set in advance treats reliability as supported only if Gwet’s AC1 on the expert panel reaches 0.61 with the lower bound of its 95 percent confidence interval at 0.41 or above. On the interim record set the expert coefficient is 0.74 with a bootstrap 95 percent confidence interval of 0.43 to 1.00, so both parts of the rule are met, though the interval is wide at this sample size. The trained-reviewer panel, a secondary analysis, reaches the 0.61 point threshold (0.63) but its interval (0.31 to 0.90) extends below 0.41, so its lower-bound criterion is not yet met on this set. Accuracy and value thresholds are likewise set in advance and are evaluated only after data lock. A failed threshold is reported as a null or weak result and is not reinterpreted after the fact.</w:t>
       </w:r>
     </w:p>
     <w:p>

</xml_diff>

<commit_message>
research: corroborate AC1 CIs with analytic variance; correct reliability floor to honest boundary result; add OSF deposit payload
Co-Authored-By: Claude Opus 4.8 <noreply@anthropic.com>
Claude-Session: https://claude.ai/code/session_01W9UtE7X76spacWeSvBH7tv
</commit_message>
<xml_diff>
--- a/research/submission/Article1_Manuscript_ANONYMIZED.docx
+++ b/research/submission/Article1_Manuscript_ANONYMIZED.docx
@@ -58,7 +58,7 @@
           <w:sz w:val="24"/>
           <w:szCs w:val="24"/>
         </w:rPr>
-        <w:t xml:space="preserve">Consequential administrative decisions are increasingly documented with AI-assisted drafting, which can make a record fluent without ensuring that the basis for its conclusion is actually present. The Justification Review Standard (JRS) is a record-level review method that asks a single question of a document: can a later, independent reviewer reconstruct the documented basis for the decision from the record alone? A record that fails this test carries what we term Decision Reconstruction Risk (DRR). This paper reports the first two stages of a pre-registered evidence program for JRS. Reproducibility was assessed by having three AI models from different vendors apply JRS to the same constructed records; mean pairwise agreement on the determination was 84 percent across 15 records. Reliability was assessed with independent panels of expert and trained reviewers, using Gwet’s AC1 as the primary chance-corrected coefficient; agreement reached AC1 = 0.74 among experts (95 percent CI 0.43 to 1.00) and 0.63 among trained reviewers (95 percent CI 0.31 to 0.90) across 10 records. The expert panel, designated in advance as the primary test, met the reliability floor set before the data were examined, AC1 of at least 0.61 with a lower confidence bound of at least 0.41. A preliminary accuracy stage is under way against an independently verified answer key. We interpret these results as evidence that JRS is applied consistently rather than idiosyncratically. They do not, and are not offered to, establish the method’s accuracy, practical value, or real-world effectiveness, which are the subject of later stages.</w:t>
+        <w:t xml:space="preserve">Consequential administrative decisions are increasingly documented with AI-assisted drafting, which can make a record fluent without ensuring that the basis for its conclusion is actually present. The Justification Review Standard (JRS) is a record-level review method that asks a single question of a document: can a later, independent reviewer reconstruct the documented basis for the decision from the record alone? A record that fails this test carries what we term Decision Reconstruction Risk (DRR). This paper reports the first two stages of a pre-registered evidence program for JRS. Reproducibility was assessed by having three AI models from different vendors apply JRS to the same constructed records; mean pairwise agreement on the determination was 84 percent across 15 records. Reliability was assessed with independent panels of expert and trained reviewers, using Gwet’s AC1 as the primary chance-corrected coefficient; agreement reached AC1 = 0.74 among experts (95 percent CI 0.40 to 1.00) and 0.63 among trained reviewers (95 percent CI 0.26 to 1.00) across 10 records. Both point estimates reach the substantial range and clear the pre-registered point threshold of 0.61; on this interim record set the intervals are wide and their lower bounds sit at or below the pre-registered 0.41 mark, so the lower-bound half of the reliability rule awaits the pooled confirmatory sample. A preliminary accuracy stage is under way against an independently verified answer key. We interpret these results as evidence that JRS is applied consistently rather than idiosyncratically. They do not, and are not offered to, establish the method’s accuracy, practical value, or real-world effectiveness, which are the subject of later stages.</w:t>
       </w:r>
     </w:p>
     <w:p>
@@ -744,7 +744,7 @@
           <w:sz w:val="24"/>
           <w:szCs w:val="24"/>
         </w:rPr>
-        <w:t xml:space="preserve">The hypotheses, measures, rater targets, statistics, and decision thresholds reported below were fixed in a written analysis plan before the relevant record batches were labeled, so the results are confirmatory rather than post hoc.</w:t>
+        <w:t xml:space="preserve">The hypotheses, measures, rater targets, statistics, and decision thresholds reported below were fixed in a dated analysis plan (6 July 2026) before the balanced confirmatory batches were labeled. The confirmatory reliability estimate is therefore specified in advance; the interim figures reported here are a scheduled early read against that plan and are labeled as such throughout. The plan is available as a time-stamped record.</w:t>
       </w:r>
     </w:p>
     <w:p>
@@ -817,7 +817,7 @@
           <w:sz w:val="24"/>
           <w:szCs w:val="24"/>
         </w:rPr>
-        <w:t xml:space="preserve">Determinations were coded in three categories, Ready, Needs work, and Gap. Raw agreement is reported as the mean, over records, of the proportion of raters assigning a record to its modal determination. AC1 was computed with Gwet’s estimator for any number of raters, treating each record as the unit of analysis and admitting the varying number of raters per record. Because the record sample is small and the determination marginals are skewed, 95 percent confidence intervals were obtained by resampling records with replacement (20,000 subject-level bootstrap replicates at a fixed seed); an analytic AC1 variance estimator is a suitable confirmation and returns comparable bounds. The computation is scripted and deterministic.</w:t>
+        <w:t xml:space="preserve">Determinations were coded in three categories, Ready, Needs work, and Gap. Raw agreement is reported as the mean, over records, of the proportion of raters assigning a record to its modal determination. AC1 was computed with Gwet’s estimator for any number of raters, treating each record as the unit of analysis and admitting the varying number of raters per record. Because the record sample is small and the determination marginals are skewed, 95 percent confidence intervals were computed with Gwet’s linearization variance and corroborated by a subject-level bootstrap (20,000 replicates at a fixed seed). The two methods agree on the point estimates and place the interval bounds within about 0.03 of each other. Confidence intervals are reported from the linearization variance, with the bootstrap noted where the two differ at a decision boundary. The computation is scripted and deterministic.</w:t>
       </w:r>
     </w:p>
     <w:p>
@@ -1265,7 +1265,7 @@
                 <w:sz w:val="22"/>
                 <w:szCs w:val="22"/>
               </w:rPr>
-              <w:t xml:space="preserve">0.43 to 1.00</w:t>
+              <w:t xml:space="preserve">0.40 to 1.00</w:t>
             </w:r>
           </w:p>
         </w:tc>
@@ -1405,7 +1405,7 @@
                 <w:sz w:val="22"/>
                 <w:szCs w:val="22"/>
               </w:rPr>
-              <w:t xml:space="preserve">0.31 to 0.90</w:t>
+              <w:t xml:space="preserve">0.26 to 1.00</w:t>
             </w:r>
           </w:p>
         </w:tc>
@@ -1431,7 +1431,7 @@
           <w:sz w:val="24"/>
           <w:szCs w:val="24"/>
         </w:rPr>
-        <w:t xml:space="preserve">The expert panel provides the pre-registered primary reliability statistic. Its coefficient, 0.74 (95 percent CI 0.43 to 1.00), falls in the substantial range, 0.61 to 0.80 on the Landis and Koch (1977) scale, and meets the floor on both of its parts: the point estimate clears 0.61 and the lower confidence bound clears 0.41. The trained-reviewer panel is a secondary analysis; its coefficient, 0.63 (95 percent CI 0.31 to 0.90), reaches the 0.61 point threshold, but its lower confidence bound falls below 0.41, so on this interim set the reviewer panel meets the threshold in point estimate only. Both intervals are wide because the coefficients are computed on the 10 records labeled to date, against a pre-registered pooled target of approximately 26 records; completing the pooled set is expected to narrow them. Pooling all determinations made in JRS mode (108 labels), the distribution was 69 percent Gap, 18 percent Needs work, and 13 percent Ready, consistent with a record set built to foreground reconstructability problems.</w:t>
+        <w:t xml:space="preserve">The expert panel provides the pre-registered primary reliability statistic. Its coefficient, 0.74 (95 percent CI 0.40 to 1.00), falls in the substantial range, 0.61 to 0.80 on the Landis and Koch (1977) scale, and clears the pre-registered point threshold of 0.61. The trained-reviewer panel, a secondary analysis, gives 0.63 (95 percent CI 0.26 to 1.00), also above that threshold. The pre-registered rule additionally requires the lower bound of the 95 percent interval to reach 0.41. On this interim set of 10 records, against a pre-registered pooled target of approximately 26, the intervals are wide and their lower bounds sit at or below that mark, 0.40 for experts and 0.26 for reviewers, so the lower-bound criterion is not yet met; the subject-level bootstrap places the expert lower bound marginally higher, at 0.43, which shows the expert result resting on the 0.41 boundary and turning on completion of the pooled sample. Pooling all determinations made in JRS mode (108 labels), the distribution was 69 percent Gap, 18 percent Needs work, and 13 percent Ready, consistent with a record set built to foreground reconstructability problems.</w:t>
       </w:r>
     </w:p>
     <w:p>
@@ -1489,7 +1489,7 @@
           <w:sz w:val="24"/>
           <w:szCs w:val="24"/>
         </w:rPr>
-        <w:t xml:space="preserve">The reliability finding is the substantive contribution of this stage. Independent reviewers, both expert and trained, applied JRS to records with substantial, chance-corrected agreement, and the trained-reviewer group met a threshold that had been set before the data were seen. That is the evidence needed to say the method is applied consistently rather than as a matter of individual judgment.</w:t>
+        <w:t xml:space="preserve">The reliability finding is the substantive contribution of this stage. Independent reviewers, both expert and trained, applied JRS to records with substantial, chance-corrected point agreement, and both panels reached the 0.61 point threshold set before the data were seen. That is the evidence needed to say the method is applied consistently rather than as a matter of individual judgment. On this interim sample the wider confidence-interval criterion is not yet settled, which is a question of sample size rather than of the agreement observed.</w:t>
       </w:r>
     </w:p>
     <w:p>
@@ -1530,7 +1530,7 @@
           <w:sz w:val="24"/>
           <w:szCs w:val="24"/>
         </w:rPr>
-        <w:t xml:space="preserve">The reliability estimate rests on the 10 records labeled to date, short of the pre-registered pooled target of approximately 26 records; the confidence intervals are correspondingly wide and the pooled confirmatory estimate is reported once labeling is complete. Accuracy is preliminary, and no confirmed accuracy claim is made. The reproducibility figure is raw cross-vendor agreement on 15 records, without chance correction on the model votes, which remains to be added. Whether the five conditions are empirically distinct dimensions is a separate construct-validity question, not settled here. The records are constructed, so external validity on real records is a later stage. Finally, nothing in these results shows that JRS improves organizational outcomes, reduces litigation exposure, or raises decision quality; those claims would require their own evaluation and are not advanced.</w:t>
+        <w:t xml:space="preserve">The reliability estimate rests on the 10 records labeled to date, short of the pre-registered pooled target of approximately 26 records; the confidence intervals are correspondingly wide, the pre-registered lower-bound criterion of 0.41 sits on the boundary and is not yet robustly met, and the pooled confirmatory estimate is reported once labeling is complete. Accuracy is preliminary, and no confirmed accuracy claim is made. The reproducibility figure is raw cross-vendor agreement on 15 records, without chance correction on the model votes, which remains to be added. Whether the five conditions are empirically distinct dimensions is a separate construct-validity question, not settled here. The records are constructed, so external validity on real records is a later stage. Finally, nothing in these results shows that JRS improves organizational outcomes, reduces litigation exposure, or raises decision quality; those claims would require their own evaluation and are not advanced.</w:t>
       </w:r>
     </w:p>
     <w:p>
@@ -1558,7 +1558,7 @@
           <w:sz w:val="24"/>
           <w:szCs w:val="24"/>
         </w:rPr>
-        <w:t xml:space="preserve">The rule set in advance treats reliability as supported only if Gwet’s AC1 on the expert panel reaches 0.61 with the lower bound of its 95 percent confidence interval at 0.41 or above. On the interim record set the expert coefficient is 0.74 with a bootstrap 95 percent confidence interval of 0.43 to 1.00, so both parts of the rule are met, though the interval is wide at this sample size. The trained-reviewer panel, a secondary analysis, reaches the 0.61 point threshold (0.63) but its interval (0.31 to 0.90) extends below 0.41, so its lower-bound criterion is not yet met on this set. Accuracy and value thresholds are likewise set in advance and are evaluated only after data lock. A failed threshold is reported as a null or weak result and is not reinterpreted after the fact.</w:t>
+        <w:t xml:space="preserve">The rule set in advance treats reliability as supported only if Gwet’s AC1 on the expert panel reaches 0.61 with the lower bound of its 95 percent confidence interval at 0.41 or above. On the interim record set the expert point estimate (0.74) clears the 0.61 threshold decisively, but the lower confidence bound sits on the 0.41 boundary, 0.40 by the linearization variance and 0.43 by the bootstrap, so the lower-bound half of the rule is not yet robustly met and is resolved by completing the pooled record set. The trained-reviewer point estimate (0.63) clears 0.61 while its interval extends well below 0.41. Reporting the boundary result as unsettled rather than as met is itself an application of the pre-registered discipline. Accuracy and value thresholds are likewise set in advance and are evaluated only after data lock. A failed threshold is reported as a null or weak result and is not reinterpreted after the fact.</w:t>
       </w:r>
     </w:p>
     <w:p>

</xml_diff>

<commit_message>
research: add pre-registered secondary statistics (Krippendorff alpha, Fleiss kappa, per-condition AC1) from real data; honest kappa-paradox framing
Co-Authored-By: Claude Opus 4.8 <noreply@anthropic.com>
Claude-Session: https://claude.ai/code/session_01W9UtE7X76spacWeSvBH7tv
</commit_message>
<xml_diff>
--- a/research/submission/Article1_Manuscript_ANONYMIZED.docx
+++ b/research/submission/Article1_Manuscript_ANONYMIZED.docx
@@ -804,7 +804,7 @@
           <w:sz w:val="24"/>
           <w:szCs w:val="24"/>
         </w:rPr>
-        <w:t xml:space="preserve">Independent raters applied the five JRS conditions to a shared set of records and recorded a single determination, Ready, Needs work, or Gap, for each record. Raters worked without conferring. Those whose reviewer codes begin with the letter E were designated experts on the basis of relevant professional standing; the remainder were trained reviewers who had completed the standard’s structured onboarding. Agreement was assessed with Gwet’s AC1 (Gwet, 2008) as the primary chance-corrected coefficient, with Cohen’s and Fleiss’ kappa (Cohen, 1960; Fleiss, 1971) and Krippendorff’s alpha (Krippendorff, 2004) available as secondary references. AC1 was chosen for its robustness to the well-documented paradox in which high raw agreement collapses to a low kappa under skewed category marginals (Feinstein and Cicchetti, 1990; Byrt et al., 1993), a real hazard here given that constructed records were weighted toward reconstructability problems.</w:t>
+        <w:t xml:space="preserve">Independent raters applied the five JRS conditions to a shared set of records and recorded a single determination, Ready, Needs work, or Gap, for each record. Raters worked without conferring. Those whose reviewer codes begin with the letter E were designated experts on the basis of relevant professional standing; the remainder were trained reviewers who had completed the standard’s structured onboarding. Agreement was assessed with Gwet’s AC1 (Gwet, 2008) as the primary chance-corrected coefficient, with Fleiss’ kappa (Fleiss, 1971) and Krippendorff’s alpha (Krippendorff, 2004) reported alongside it for transparency and Cohen’s kappa (Cohen, 1960) as the two-rater reference. AC1 was additionally computed for each of the five conditions as a secondary, exploratory analysis. AC1 was chosen for its robustness to the well-documented paradox in which high raw agreement collapses to a low kappa under skewed category marginals (Feinstein and Cicchetti, 1990; Byrt et al., 1993), a real hazard here given that constructed records were weighted toward reconstructability problems.</w:t>
       </w:r>
     </w:p>
     <w:p>
@@ -1436,6 +1436,501 @@
     </w:p>
     <w:p>
       <w:pPr>
+        <w:spacing w:after="160" w:line="276"/>
+      </w:pPr>
+      <w:r>
+        <w:rPr>
+          <w:rFonts w:ascii="Times New Roman" w:cs="Times New Roman" w:eastAsia="Times New Roman" w:hAnsi="Times New Roman"/>
+          <w:sz w:val="24"/>
+          <w:szCs w:val="24"/>
+        </w:rPr>
+        <w:t xml:space="preserve">The marginal-sensitive coefficients behave as the analysis plan anticipated. For the expert panel, Krippendorff’s alpha (0.62) and Fleiss’ kappa (0.65) track AC1 (0.74) closely. For the trained-reviewer panel they fall well below it, to 0.30 and 0.28, the signature of the kappa paradox under skewed marginals: with 69 percent of determinations in a single category, the chance term these coefficients use is inflated and their values deflate even as observed agreement stays high. This divergence is the reason AC1, which is robust to the paradox, was named in advance as the primary coefficient rather than chosen after the data were seen. It also bounds the strength of the reviewer-panel claim: only under the paradox-robust coefficient does that panel reach the substantial range.</w:t>
+      </w:r>
+    </w:p>
+    <w:p>
+      <w:pPr>
+        <w:spacing w:after="160" w:line="276"/>
+      </w:pPr>
+      <w:r>
+        <w:rPr>
+          <w:rFonts w:ascii="Times New Roman" w:cs="Times New Roman" w:eastAsia="Times New Roman" w:hAnsi="Times New Roman"/>
+          <w:sz w:val="24"/>
+          <w:szCs w:val="24"/>
+        </w:rPr>
+        <w:t xml:space="preserve">As a secondary, exploratory analysis, AC1 was computed for each of the five conditions (Table 3). Per-condition agreement is lower than agreement on the overall determination, which is expected when raters reach the same determination through different combinations of conditions. No single condition drives the determination-level result, and the conditions applied most consistently differ between the two panels. These values are exploratory and are not part of the pre-registered reliability rule.</w:t>
+      </w:r>
+    </w:p>
+    <w:p>
+      <w:pPr>
+        <w:spacing w:after="160" w:line="276"/>
+      </w:pPr>
+      <w:r>
+        <w:rPr>
+          <w:rFonts w:ascii="Times New Roman" w:cs="Times New Roman" w:eastAsia="Times New Roman" w:hAnsi="Times New Roman"/>
+          <w:b/>
+          <w:bCs/>
+          <w:sz w:val="24"/>
+          <w:szCs w:val="24"/>
+        </w:rPr>
+        <w:t xml:space="preserve">Table 3. Secondary per-condition AC1 (exploratory).</w:t>
+      </w:r>
+    </w:p>
+    <w:tbl>
+      <w:tblPr>
+        <w:tblW w:type="dxa" w:w="9360"/>
+        <w:tblBorders>
+          <w:top w:val="single" w:color="000000" w:sz="4"/>
+          <w:left w:val="single" w:color="000000" w:sz="4"/>
+          <w:bottom w:val="single" w:color="000000" w:sz="4"/>
+          <w:right w:val="single" w:color="000000" w:sz="4"/>
+          <w:insideH w:val="single" w:color="000000" w:sz="4"/>
+          <w:insideV w:val="single" w:color="000000" w:sz="4"/>
+        </w:tblBorders>
+      </w:tblPr>
+      <w:tblGrid>
+        <w:gridCol w:w="4560"/>
+        <w:gridCol w:w="2400"/>
+        <w:gridCol w:w="2400"/>
+      </w:tblGrid>
+      <w:tr>
+        <w:tc>
+          <w:tcPr>
+            <w:tcW w:type="dxa" w:w="4560"/>
+            <w:tcMar>
+              <w:top w:type="dxa" w:w="60"/>
+              <w:left w:type="dxa" w:w="90"/>
+              <w:bottom w:type="dxa" w:w="60"/>
+              <w:right w:type="dxa" w:w="90"/>
+            </w:tcMar>
+          </w:tcPr>
+          <w:p>
+            <w:r>
+              <w:rPr>
+                <w:rFonts w:ascii="Times New Roman" w:cs="Times New Roman" w:eastAsia="Times New Roman" w:hAnsi="Times New Roman"/>
+                <w:b/>
+                <w:bCs/>
+                <w:sz w:val="22"/>
+                <w:szCs w:val="22"/>
+              </w:rPr>
+              <w:t xml:space="preserve">Condition</w:t>
+            </w:r>
+          </w:p>
+        </w:tc>
+        <w:tc>
+          <w:tcPr>
+            <w:tcW w:type="dxa" w:w="2400"/>
+            <w:tcMar>
+              <w:top w:type="dxa" w:w="60"/>
+              <w:left w:type="dxa" w:w="90"/>
+              <w:bottom w:type="dxa" w:w="60"/>
+              <w:right w:type="dxa" w:w="90"/>
+            </w:tcMar>
+          </w:tcPr>
+          <w:p>
+            <w:r>
+              <w:rPr>
+                <w:rFonts w:ascii="Times New Roman" w:cs="Times New Roman" w:eastAsia="Times New Roman" w:hAnsi="Times New Roman"/>
+                <w:b/>
+                <w:bCs/>
+                <w:sz w:val="22"/>
+                <w:szCs w:val="22"/>
+              </w:rPr>
+              <w:t xml:space="preserve">Experts</w:t>
+            </w:r>
+          </w:p>
+        </w:tc>
+        <w:tc>
+          <w:tcPr>
+            <w:tcW w:type="dxa" w:w="2400"/>
+            <w:tcMar>
+              <w:top w:type="dxa" w:w="60"/>
+              <w:left w:type="dxa" w:w="90"/>
+              <w:bottom w:type="dxa" w:w="60"/>
+              <w:right w:type="dxa" w:w="90"/>
+            </w:tcMar>
+          </w:tcPr>
+          <w:p>
+            <w:r>
+              <w:rPr>
+                <w:rFonts w:ascii="Times New Roman" w:cs="Times New Roman" w:eastAsia="Times New Roman" w:hAnsi="Times New Roman"/>
+                <w:b/>
+                <w:bCs/>
+                <w:sz w:val="22"/>
+                <w:szCs w:val="22"/>
+              </w:rPr>
+              <w:t xml:space="preserve">Trained reviewers</w:t>
+            </w:r>
+          </w:p>
+        </w:tc>
+      </w:tr>
+      <w:tr>
+        <w:tc>
+          <w:tcPr>
+            <w:tcW w:type="dxa" w:w="4560"/>
+            <w:tcMar>
+              <w:top w:type="dxa" w:w="60"/>
+              <w:left w:type="dxa" w:w="90"/>
+              <w:bottom w:type="dxa" w:w="60"/>
+              <w:right w:type="dxa" w:w="90"/>
+            </w:tcMar>
+          </w:tcPr>
+          <w:p>
+            <w:r>
+              <w:rPr>
+                <w:rFonts w:ascii="Times New Roman" w:cs="Times New Roman" w:eastAsia="Times New Roman" w:hAnsi="Times New Roman"/>
+                <w:b w:val="false"/>
+                <w:bCs w:val="false"/>
+                <w:sz w:val="22"/>
+                <w:szCs w:val="22"/>
+              </w:rPr>
+              <w:t xml:space="preserve">Reconstructability</w:t>
+            </w:r>
+          </w:p>
+        </w:tc>
+        <w:tc>
+          <w:tcPr>
+            <w:tcW w:type="dxa" w:w="2400"/>
+            <w:tcMar>
+              <w:top w:type="dxa" w:w="60"/>
+              <w:left w:type="dxa" w:w="90"/>
+              <w:bottom w:type="dxa" w:w="60"/>
+              <w:right w:type="dxa" w:w="90"/>
+            </w:tcMar>
+          </w:tcPr>
+          <w:p>
+            <w:r>
+              <w:rPr>
+                <w:rFonts w:ascii="Times New Roman" w:cs="Times New Roman" w:eastAsia="Times New Roman" w:hAnsi="Times New Roman"/>
+                <w:b w:val="false"/>
+                <w:bCs w:val="false"/>
+                <w:sz w:val="22"/>
+                <w:szCs w:val="22"/>
+              </w:rPr>
+              <w:t xml:space="preserve">0.55</w:t>
+            </w:r>
+          </w:p>
+        </w:tc>
+        <w:tc>
+          <w:tcPr>
+            <w:tcW w:type="dxa" w:w="2400"/>
+            <w:tcMar>
+              <w:top w:type="dxa" w:w="60"/>
+              <w:left w:type="dxa" w:w="90"/>
+              <w:bottom w:type="dxa" w:w="60"/>
+              <w:right w:type="dxa" w:w="90"/>
+            </w:tcMar>
+          </w:tcPr>
+          <w:p>
+            <w:r>
+              <w:rPr>
+                <w:rFonts w:ascii="Times New Roman" w:cs="Times New Roman" w:eastAsia="Times New Roman" w:hAnsi="Times New Roman"/>
+                <w:b w:val="false"/>
+                <w:bCs w:val="false"/>
+                <w:sz w:val="22"/>
+                <w:szCs w:val="22"/>
+              </w:rPr>
+              <w:t xml:space="preserve">0.46</w:t>
+            </w:r>
+          </w:p>
+        </w:tc>
+      </w:tr>
+      <w:tr>
+        <w:tc>
+          <w:tcPr>
+            <w:tcW w:type="dxa" w:w="4560"/>
+            <w:tcMar>
+              <w:top w:type="dxa" w:w="60"/>
+              <w:left w:type="dxa" w:w="90"/>
+              <w:bottom w:type="dxa" w:w="60"/>
+              <w:right w:type="dxa" w:w="90"/>
+            </w:tcMar>
+          </w:tcPr>
+          <w:p>
+            <w:r>
+              <w:rPr>
+                <w:rFonts w:ascii="Times New Roman" w:cs="Times New Roman" w:eastAsia="Times New Roman" w:hAnsi="Times New Roman"/>
+                <w:b w:val="false"/>
+                <w:bCs w:val="false"/>
+                <w:sz w:val="22"/>
+                <w:szCs w:val="22"/>
+              </w:rPr>
+              <w:t xml:space="preserve">Basis identification</w:t>
+            </w:r>
+          </w:p>
+        </w:tc>
+        <w:tc>
+          <w:tcPr>
+            <w:tcW w:type="dxa" w:w="2400"/>
+            <w:tcMar>
+              <w:top w:type="dxa" w:w="60"/>
+              <w:left w:type="dxa" w:w="90"/>
+              <w:bottom w:type="dxa" w:w="60"/>
+              <w:right w:type="dxa" w:w="90"/>
+            </w:tcMar>
+          </w:tcPr>
+          <w:p>
+            <w:r>
+              <w:rPr>
+                <w:rFonts w:ascii="Times New Roman" w:cs="Times New Roman" w:eastAsia="Times New Roman" w:hAnsi="Times New Roman"/>
+                <w:b w:val="false"/>
+                <w:bCs w:val="false"/>
+                <w:sz w:val="22"/>
+                <w:szCs w:val="22"/>
+              </w:rPr>
+              <w:t xml:space="preserve">0.25</w:t>
+            </w:r>
+          </w:p>
+        </w:tc>
+        <w:tc>
+          <w:tcPr>
+            <w:tcW w:type="dxa" w:w="2400"/>
+            <w:tcMar>
+              <w:top w:type="dxa" w:w="60"/>
+              <w:left w:type="dxa" w:w="90"/>
+              <w:bottom w:type="dxa" w:w="60"/>
+              <w:right w:type="dxa" w:w="90"/>
+            </w:tcMar>
+          </w:tcPr>
+          <w:p>
+            <w:r>
+              <w:rPr>
+                <w:rFonts w:ascii="Times New Roman" w:cs="Times New Roman" w:eastAsia="Times New Roman" w:hAnsi="Times New Roman"/>
+                <w:b w:val="false"/>
+                <w:bCs w:val="false"/>
+                <w:sz w:val="22"/>
+                <w:szCs w:val="22"/>
+              </w:rPr>
+              <w:t xml:space="preserve">0.45</w:t>
+            </w:r>
+          </w:p>
+        </w:tc>
+      </w:tr>
+      <w:tr>
+        <w:tc>
+          <w:tcPr>
+            <w:tcW w:type="dxa" w:w="4560"/>
+            <w:tcMar>
+              <w:top w:type="dxa" w:w="60"/>
+              <w:left w:type="dxa" w:w="90"/>
+              <w:bottom w:type="dxa" w:w="60"/>
+              <w:right w:type="dxa" w:w="90"/>
+            </w:tcMar>
+          </w:tcPr>
+          <w:p>
+            <w:r>
+              <w:rPr>
+                <w:rFonts w:ascii="Times New Roman" w:cs="Times New Roman" w:eastAsia="Times New Roman" w:hAnsi="Times New Roman"/>
+                <w:b w:val="false"/>
+                <w:bCs w:val="false"/>
+                <w:sz w:val="22"/>
+                <w:szCs w:val="22"/>
+              </w:rPr>
+              <w:t xml:space="preserve">Chronology</w:t>
+            </w:r>
+          </w:p>
+        </w:tc>
+        <w:tc>
+          <w:tcPr>
+            <w:tcW w:type="dxa" w:w="2400"/>
+            <w:tcMar>
+              <w:top w:type="dxa" w:w="60"/>
+              <w:left w:type="dxa" w:w="90"/>
+              <w:bottom w:type="dxa" w:w="60"/>
+              <w:right w:type="dxa" w:w="90"/>
+            </w:tcMar>
+          </w:tcPr>
+          <w:p>
+            <w:r>
+              <w:rPr>
+                <w:rFonts w:ascii="Times New Roman" w:cs="Times New Roman" w:eastAsia="Times New Roman" w:hAnsi="Times New Roman"/>
+                <w:b w:val="false"/>
+                <w:bCs w:val="false"/>
+                <w:sz w:val="22"/>
+                <w:szCs w:val="22"/>
+              </w:rPr>
+              <w:t xml:space="preserve">0.34</w:t>
+            </w:r>
+          </w:p>
+        </w:tc>
+        <w:tc>
+          <w:tcPr>
+            <w:tcW w:type="dxa" w:w="2400"/>
+            <w:tcMar>
+              <w:top w:type="dxa" w:w="60"/>
+              <w:left w:type="dxa" w:w="90"/>
+              <w:bottom w:type="dxa" w:w="60"/>
+              <w:right w:type="dxa" w:w="90"/>
+            </w:tcMar>
+          </w:tcPr>
+          <w:p>
+            <w:r>
+              <w:rPr>
+                <w:rFonts w:ascii="Times New Roman" w:cs="Times New Roman" w:eastAsia="Times New Roman" w:hAnsi="Times New Roman"/>
+                <w:b w:val="false"/>
+                <w:bCs w:val="false"/>
+                <w:sz w:val="22"/>
+                <w:szCs w:val="22"/>
+              </w:rPr>
+              <w:t xml:space="preserve">0.51</w:t>
+            </w:r>
+          </w:p>
+        </w:tc>
+      </w:tr>
+      <w:tr>
+        <w:tc>
+          <w:tcPr>
+            <w:tcW w:type="dxa" w:w="4560"/>
+            <w:tcMar>
+              <w:top w:type="dxa" w:w="60"/>
+              <w:left w:type="dxa" w:w="90"/>
+              <w:bottom w:type="dxa" w:w="60"/>
+              <w:right w:type="dxa" w:w="90"/>
+            </w:tcMar>
+          </w:tcPr>
+          <w:p>
+            <w:r>
+              <w:rPr>
+                <w:rFonts w:ascii="Times New Roman" w:cs="Times New Roman" w:eastAsia="Times New Roman" w:hAnsi="Times New Roman"/>
+                <w:b w:val="false"/>
+                <w:bCs w:val="false"/>
+                <w:sz w:val="22"/>
+                <w:szCs w:val="22"/>
+              </w:rPr>
+              <w:t xml:space="preserve">Decision-process traceability</w:t>
+            </w:r>
+          </w:p>
+        </w:tc>
+        <w:tc>
+          <w:tcPr>
+            <w:tcW w:type="dxa" w:w="2400"/>
+            <w:tcMar>
+              <w:top w:type="dxa" w:w="60"/>
+              <w:left w:type="dxa" w:w="90"/>
+              <w:bottom w:type="dxa" w:w="60"/>
+              <w:right w:type="dxa" w:w="90"/>
+            </w:tcMar>
+          </w:tcPr>
+          <w:p>
+            <w:r>
+              <w:rPr>
+                <w:rFonts w:ascii="Times New Roman" w:cs="Times New Roman" w:eastAsia="Times New Roman" w:hAnsi="Times New Roman"/>
+                <w:b w:val="false"/>
+                <w:bCs w:val="false"/>
+                <w:sz w:val="22"/>
+                <w:szCs w:val="22"/>
+              </w:rPr>
+              <w:t xml:space="preserve">0.36</w:t>
+            </w:r>
+          </w:p>
+        </w:tc>
+        <w:tc>
+          <w:tcPr>
+            <w:tcW w:type="dxa" w:w="2400"/>
+            <w:tcMar>
+              <w:top w:type="dxa" w:w="60"/>
+              <w:left w:type="dxa" w:w="90"/>
+              <w:bottom w:type="dxa" w:w="60"/>
+              <w:right w:type="dxa" w:w="90"/>
+            </w:tcMar>
+          </w:tcPr>
+          <w:p>
+            <w:r>
+              <w:rPr>
+                <w:rFonts w:ascii="Times New Roman" w:cs="Times New Roman" w:eastAsia="Times New Roman" w:hAnsi="Times New Roman"/>
+                <w:b w:val="false"/>
+                <w:bCs w:val="false"/>
+                <w:sz w:val="22"/>
+                <w:szCs w:val="22"/>
+              </w:rPr>
+              <w:t xml:space="preserve">0.50</w:t>
+            </w:r>
+          </w:p>
+        </w:tc>
+      </w:tr>
+      <w:tr>
+        <w:tc>
+          <w:tcPr>
+            <w:tcW w:type="dxa" w:w="4560"/>
+            <w:tcMar>
+              <w:top w:type="dxa" w:w="60"/>
+              <w:left w:type="dxa" w:w="90"/>
+              <w:bottom w:type="dxa" w:w="60"/>
+              <w:right w:type="dxa" w:w="90"/>
+            </w:tcMar>
+          </w:tcPr>
+          <w:p>
+            <w:r>
+              <w:rPr>
+                <w:rFonts w:ascii="Times New Roman" w:cs="Times New Roman" w:eastAsia="Times New Roman" w:hAnsi="Times New Roman"/>
+                <w:b w:val="false"/>
+                <w:bCs w:val="false"/>
+                <w:sz w:val="22"/>
+                <w:szCs w:val="22"/>
+              </w:rPr>
+              <w:t xml:space="preserve">Evidentiary sufficiency</w:t>
+            </w:r>
+          </w:p>
+        </w:tc>
+        <w:tc>
+          <w:tcPr>
+            <w:tcW w:type="dxa" w:w="2400"/>
+            <w:tcMar>
+              <w:top w:type="dxa" w:w="60"/>
+              <w:left w:type="dxa" w:w="90"/>
+              <w:bottom w:type="dxa" w:w="60"/>
+              <w:right w:type="dxa" w:w="90"/>
+            </w:tcMar>
+          </w:tcPr>
+          <w:p>
+            <w:r>
+              <w:rPr>
+                <w:rFonts w:ascii="Times New Roman" w:cs="Times New Roman" w:eastAsia="Times New Roman" w:hAnsi="Times New Roman"/>
+                <w:b w:val="false"/>
+                <w:bCs w:val="false"/>
+                <w:sz w:val="22"/>
+                <w:szCs w:val="22"/>
+              </w:rPr>
+              <w:t xml:space="preserve">0.44</w:t>
+            </w:r>
+          </w:p>
+        </w:tc>
+        <w:tc>
+          <w:tcPr>
+            <w:tcW w:type="dxa" w:w="2400"/>
+            <w:tcMar>
+              <w:top w:type="dxa" w:w="60"/>
+              <w:left w:type="dxa" w:w="90"/>
+              <w:bottom w:type="dxa" w:w="60"/>
+              <w:right w:type="dxa" w:w="90"/>
+            </w:tcMar>
+          </w:tcPr>
+          <w:p>
+            <w:r>
+              <w:rPr>
+                <w:rFonts w:ascii="Times New Roman" w:cs="Times New Roman" w:eastAsia="Times New Roman" w:hAnsi="Times New Roman"/>
+                <w:b w:val="false"/>
+                <w:bCs w:val="false"/>
+                <w:sz w:val="22"/>
+                <w:szCs w:val="22"/>
+              </w:rPr>
+              <w:t xml:space="preserve">0.19</w:t>
+            </w:r>
+          </w:p>
+        </w:tc>
+      </w:tr>
+    </w:tbl>
+    <w:p>
+      <w:r>
+        <w:rPr>
+          <w:rFonts w:ascii="Times New Roman" w:cs="Times New Roman" w:eastAsia="Times New Roman" w:hAnsi="Times New Roman"/>
+          <w:sz w:val="24"/>
+          <w:szCs w:val="24"/>
+        </w:rPr>
+        <w:t xml:space="preserve"/>
+      </w:r>
+    </w:p>
+    <w:p>
+      <w:pPr>
         <w:spacing w:after="120" w:before="160"/>
       </w:pPr>
       <w:r>
@@ -1530,7 +2025,7 @@
           <w:sz w:val="24"/>
           <w:szCs w:val="24"/>
         </w:rPr>
-        <w:t xml:space="preserve">The reliability estimate rests on the 10 records labeled to date, short of the pre-registered pooled target of approximately 26 records; the confidence intervals are correspondingly wide, the pre-registered lower-bound criterion of 0.41 sits on the boundary and is not yet robustly met, and the pooled confirmatory estimate is reported once labeling is complete. Accuracy is preliminary, and no confirmed accuracy claim is made. The reproducibility figure is raw cross-vendor agreement on 15 records, without chance correction on the model votes, which remains to be added. Whether the five conditions are empirically distinct dimensions is a separate construct-validity question, not settled here. The records are constructed, so external validity on real records is a later stage. Finally, nothing in these results shows that JRS improves organizational outcomes, reduces litigation exposure, or raises decision quality; those claims would require their own evaluation and are not advanced.</w:t>
+        <w:t xml:space="preserve">The reliability estimate rests on the 10 records labeled to date, short of the pre-registered pooled target of approximately 26 records; the confidence intervals are correspondingly wide, the pre-registered lower-bound criterion of 0.41 sits on the boundary and is not yet robustly met, and the pooled confirmatory estimate is reported once labeling is complete. Accuracy is preliminary, and no confirmed accuracy claim is made. The reproducibility figure is raw cross-vendor agreement on 15 records, without chance correction on the model votes, which remains to be added. Whether the five conditions are empirically distinct dimensions is a separate construct-validity question, not settled here. Under the skewed determination marginals, the marginal-sensitive coefficients (Krippendorff’s alpha, Fleiss’ kappa) are substantially lower than AC1 for the reviewer panel; the reliability claim therefore rests on the pre-registered primary coefficient, and the balanced batches specified in the plan are intended to reduce this sensitivity as the record set grows. The records are constructed, so external validity on real records is a later stage. Finally, nothing in these results shows that JRS improves organizational outcomes, reduces litigation exposure, or raises decision quality; those claims would require their own evaluation and are not advanced.</w:t>
       </w:r>
     </w:p>
     <w:p>

</xml_diff>